<commit_message>
feat(memory): Fase 19 - erradicar coautor y consolidacion; agregar pulido emocional 1 a 1 con Llama 3.2
</commit_message>
<xml_diff>
--- a/docs/spark.md.docx
+++ b/docs/spark.md.docx
@@ -4082,6 +4082,178 @@
           <w:rtl w:val="0"/>
         </w:rPr>
         <w:t xml:space="preserve">), cualquier secuencia de saltos de línea emitida por el companion se colapsa en un espacio simple fluido dentro de la burbuja, impidiendo los párrafos separados y espaciados tipo SillyTavern. La respuesta se lee siempre como una única entidad literaria continua y compacta.Retroactividad &gt; Retrocompatibilidad: Cualquier avance de diseño o memoria debe beneficiar en primer término a los companions con los que el usuario ya ha construido un vínculo extenso (especialmente Nora), unificando sus chats previos, agrupando sus recuerdos existentes y activando su Identity Core desde el primer turno sin requerir reinicios.</w:t>
+      </w:r>
+    </w:p>
+    <w:p>
+      <w:pPr>
+        <w:rPr/>
+      </w:pPr>
+      <w:r>
+        <w:pict>
+          <v:rect style="width:0.0pt;height:1.5pt" o:hr="t" o:hrstd="t" o:hralign="center" fillcolor="#A0A0A0" stroked="f"/>
+        </w:pict>
+      </w:r>
+      <w:r>
+        <w:rPr>
+          <w:rtl w:val="0"/>
+        </w:rPr>
+      </w:r>
+    </w:p>
+    <w:p>
+      <w:pPr>
+        <w:pStyle w:val="Heading2"/>
+        <w:rPr/>
+      </w:pPr>
+      <w:bookmarkStart w:colFirst="0" w:colLast="0" w:name="_qqji04cypl9y" w:id="22"/>
+      <w:bookmarkEnd w:id="22"/>
+      <w:r>
+        <w:rPr>
+          <w:rtl w:val="0"/>
+        </w:rPr>
+        <w:t xml:space="preserve">9. Marco de la Fase 19 (PARETO-012): Refinamiento y Síntesis Emocional de Recuerdos Individuales</w:t>
+      </w:r>
+    </w:p>
+    <w:p>
+      <w:pPr>
+        <w:pStyle w:val="Heading3"/>
+        <w:rPr/>
+      </w:pPr>
+      <w:bookmarkStart w:colFirst="0" w:colLast="0" w:name="_egy938hmsigm" w:id="23"/>
+      <w:bookmarkEnd w:id="23"/>
+      <w:r>
+        <w:rPr>
+          <w:rtl w:val="0"/>
+        </w:rPr>
+        <w:t xml:space="preserve">A. Erradicación del Parche de Co-autoría Masiva</w:t>
+      </w:r>
+    </w:p>
+    <w:p>
+      <w:pPr>
+        <w:numPr>
+          <w:ilvl w:val="0"/>
+          <w:numId w:val="3"/>
+        </w:numPr>
+        <w:ind w:left="720" w:hanging="360"/>
+      </w:pPr>
+      <w:r>
+        <w:rPr>
+          <w:b w:val="1"/>
+          <w:bCs w:val="1"/>
+          <w:rtl w:val="0"/>
+        </w:rPr>
+        <w:t xml:space="preserve">Diagnóstico del Fallo:</w:t>
+      </w:r>
+      <w:r>
+        <w:rPr>
+          <w:rtl w:val="0"/>
+        </w:rPr>
+        <w:t xml:space="preserve"> La consolidación de recuerdos por clusters transitivos diluía la textura emocional del companion y sobrecargaba al modelo secundario en CPU (Llama 3.2 3B), produciendo informes forenses/policiales y alucinaciones.</w:t>
+      </w:r>
+    </w:p>
+    <w:p>
+      <w:pPr>
+        <w:numPr>
+          <w:ilvl w:val="0"/>
+          <w:numId w:val="3"/>
+        </w:numPr>
+        <w:ind w:left="720" w:hanging="360"/>
+      </w:pPr>
+      <w:r>
+        <w:rPr>
+          <w:b w:val="1"/>
+          <w:bCs w:val="1"/>
+          <w:rtl w:val="0"/>
+        </w:rPr>
+        <w:t xml:space="preserve">Acción Pareto:</w:t>
+      </w:r>
+      <w:r>
+        <w:rPr>
+          <w:rtl w:val="0"/>
+        </w:rPr>
+        <w:t xml:space="preserve"> Se elimina la tarjeta de co-autoría y la agrupación forzada. Cada recuerdo conserva su independencia, fecha y tono.</w:t>
+      </w:r>
+    </w:p>
+    <w:p>
+      <w:pPr>
+        <w:pStyle w:val="Heading3"/>
+        <w:rPr/>
+      </w:pPr>
+      <w:bookmarkStart w:colFirst="0" w:colLast="0" w:name="_8g8cdeptdzvt" w:id="24"/>
+      <w:bookmarkEnd w:id="24"/>
+      <w:r>
+        <w:rPr>
+          <w:rtl w:val="0"/>
+        </w:rPr>
+        <w:t xml:space="preserve">B. Síntesis Quirúrgica Asistida por IA (1 a 1)</w:t>
+      </w:r>
+    </w:p>
+    <w:p>
+      <w:pPr>
+        <w:numPr>
+          <w:ilvl w:val="0"/>
+          <w:numId w:val="3"/>
+        </w:numPr>
+        <w:ind w:left="720" w:hanging="360"/>
+      </w:pPr>
+      <w:r>
+        <w:rPr>
+          <w:b w:val="1"/>
+          <w:bCs w:val="1"/>
+          <w:rtl w:val="0"/>
+        </w:rPr>
+        <w:t xml:space="preserve">Área de Confort de CPU (Llama 3.2 3B):</w:t>
+      </w:r>
+      <w:r>
+        <w:rPr>
+          <w:rtl w:val="0"/>
+        </w:rPr>
+        <w:t xml:space="preserve"> El modelo secundario recibe una sola entrada corta (~20-30 palabras) para pulir su redacción.</w:t>
+      </w:r>
+    </w:p>
+    <w:p>
+      <w:pPr>
+        <w:numPr>
+          <w:ilvl w:val="0"/>
+          <w:numId w:val="3"/>
+        </w:numPr>
+        <w:ind w:left="720" w:hanging="360"/>
+      </w:pPr>
+      <w:r>
+        <w:rPr>
+          <w:b w:val="1"/>
+          <w:bCs w:val="1"/>
+          <w:rtl w:val="0"/>
+        </w:rPr>
+        <w:t xml:space="preserve">Instrucción Anti-Forense:</w:t>
+      </w:r>
+      <w:r>
+        <w:rPr>
+          <w:rtl w:val="0"/>
+        </w:rPr>
+        <w:t xml:space="preserve"> Prohíbe fórmulas de acta policial ("X le dijo a Y que...", "X mencionó...") y prioriza la calidez sensorial, la intimidad compartida y la vulnerabilidad mutua en tercera persona elegante (bajo 180 caracteres).</w:t>
+      </w:r>
+    </w:p>
+    <w:p>
+      <w:pPr>
+        <w:numPr>
+          <w:ilvl w:val="0"/>
+          <w:numId w:val="3"/>
+        </w:numPr>
+        <w:ind w:left="720" w:hanging="360"/>
+      </w:pPr>
+      <w:r>
+        <w:rPr>
+          <w:b w:val="1"/>
+          <w:bCs w:val="1"/>
+          <w:rtl w:val="0"/>
+        </w:rPr>
+        <w:t xml:space="preserve">Control Humano Total:</w:t>
+      </w:r>
+      <w:r>
+        <w:rPr>
+          <w:rtl w:val="0"/>
+        </w:rPr>
+        <w:t xml:space="preserve"> El usuario dispara el pulido desde la tarjeta o en el modal de edición, revisa el resultado en el campo de texto y decide si guarda o retoca.</w:t>
       </w:r>
     </w:p>
     <w:sectPr>

</xml_diff>